<commit_message>
Switch banking details to Wise USD account from LC006
Replace the RHB Bank account with the Wise USD account, effective from the
August 2026 invoice onward, and regenerate LC006 with the new details.

The template has no routing-number line, so the account-number row is
cloned to carry the ACH/wire routing number alongside the SWIFT code.
The account holder is recorded as "Kok Leong Lim", the spelling Wise
holds, since that is what the receiving bank matches against.
</commit_message>
<xml_diff>
--- a/Lifecheq Admin/Invoicing - Lim Kok Leong - August 2026.docx
+++ b/Lifecheq Admin/Invoicing - Lim Kok Leong - August 2026.docx
@@ -1912,7 +1912,7 @@
                 <w:szCs w:val="20"/>
                 <w:rtl w:val="0"/>
               </w:rPr>
-              <w:t>LIM Kok Leong</w:t>
+              <w:t>Kok Leong Lim</w:t>
             </w:r>
             <w:r>
               <w:rPr>
@@ -2001,7 +2001,7 @@
                 <w:szCs w:val="20"/>
                 <w:rtl w:val="0"/>
               </w:rPr>
-              <w:t>RHB Bank Berhad</w:t>
+              <w:t>Wise (Wise US Inc)</w:t>
             </w:r>
             <w:r>
               <w:rPr>
@@ -2090,7 +2090,7 @@
                 <w:szCs w:val="20"/>
                 <w:rtl w:val="0"/>
               </w:rPr>
-              <w:t>21407100150515</w:t>
+              <w:t>117452291368293</w:t>
             </w:r>
             <w:r>
               <w:rPr>
@@ -2131,14 +2131,6 @@
               <w:rPr>
                 <w:b w:val="1"/>
                 <w:bCs w:val="1"/>
-                <w:rtl w:val="0"/>
-              </w:rPr>
-              <w:t xml:space="preserve">SWIFT Code</w:t>
-            </w:r>
-            <w:r>
-              <w:rPr>
-                <w:b w:val="1"/>
-                <w:bCs w:val="1"/>
                 <w:i w:val="0"/>
                 <w:iCs w:val="0"/>
                 <w:color w:val="000000"/>
@@ -2146,7 +2138,7 @@
                 <w:szCs w:val="20"/>
                 <w:rtl w:val="0"/>
               </w:rPr>
-              <w:t xml:space="preserve">:</w:t>
+              <w:t>Routing Number (ACH/wire):</w:t>
             </w:r>
             <w:r>
               <w:rPr>
@@ -2187,7 +2179,7 @@
                 <w:szCs w:val="20"/>
                 <w:rtl w:val="0"/>
               </w:rPr>
-              <w:t>RHBBMYKLXXX</w:t>
+              <w:t>084009519</w:t>
             </w:r>
             <w:r>
               <w:rPr>
@@ -2230,7 +2222,7 @@
                 <w:bCs w:val="1"/>
                 <w:rtl w:val="0"/>
               </w:rPr>
-              <w:t xml:space="preserve">Bank Address</w:t>
+              <w:t xml:space="preserve">SWIFT Code</w:t>
             </w:r>
             <w:r>
               <w:rPr>
@@ -2284,7 +2276,104 @@
                 <w:szCs w:val="20"/>
                 <w:rtl w:val="0"/>
               </w:rPr>
-              <w:t>Tower One &amp; Tower Three, RHB Centre, Jalan Tun Razak, 50400 Kuala Lumpur</w:t>
+              <w:t>TRWIUS35XXX</w:t>
+            </w:r>
+            <w:r>
+              <w:rPr>
+                <w:rtl w:val="0"/>
+              </w:rPr>
+            </w:r>
+          </w:p>
+        </w:tc>
+      </w:tr>
+      <w:tr>
+        <w:trPr>
+          <w:cantSplit w:val="0"/>
+          <w:tblHeader w:val="0"/>
+        </w:trPr>
+        <w:tc>
+          <w:tcPr>
+            <w:tcBorders>
+              <w:top w:color="bfbfbf" w:space="0" w:sz="4" w:val="single"/>
+              <w:left w:color="bfbfbf" w:space="0" w:sz="4" w:val="single"/>
+              <w:bottom w:color="bfbfbf" w:space="0" w:sz="4" w:val="single"/>
+              <w:right w:color="bfbfbf" w:space="0" w:sz="4" w:val="single"/>
+            </w:tcBorders>
+            <w:shd w:fill="f2f2f2" w:val="clear"/>
+            <w:tcMar>
+              <w:top w:w="100.0" w:type="dxa"/>
+              <w:left w:w="150.0" w:type="dxa"/>
+              <w:bottom w:w="100.0" w:type="dxa"/>
+              <w:right w:w="150.0" w:type="dxa"/>
+            </w:tcMar>
+            <w:vAlign w:val="center"/>
+          </w:tcPr>
+          <w:p>
+            <w:pPr>
+              <w:jc w:val="left"/>
+              <w:rPr/>
+            </w:pPr>
+            <w:r>
+              <w:rPr>
+                <w:b w:val="1"/>
+                <w:bCs w:val="1"/>
+                <w:rtl w:val="0"/>
+              </w:rPr>
+              <w:t xml:space="preserve">Bank Address</w:t>
+            </w:r>
+            <w:r>
+              <w:rPr>
+                <w:b w:val="1"/>
+                <w:bCs w:val="1"/>
+                <w:i w:val="0"/>
+                <w:iCs w:val="0"/>
+                <w:color w:val="000000"/>
+                <w:sz w:val="20"/>
+                <w:szCs w:val="20"/>
+                <w:rtl w:val="0"/>
+              </w:rPr>
+              <w:t xml:space="preserve">:</w:t>
+            </w:r>
+            <w:r>
+              <w:rPr>
+                <w:rtl w:val="0"/>
+              </w:rPr>
+            </w:r>
+          </w:p>
+        </w:tc>
+        <w:tc>
+          <w:tcPr>
+            <w:tcBorders>
+              <w:top w:color="bfbfbf" w:space="0" w:sz="4" w:val="single"/>
+              <w:left w:color="bfbfbf" w:space="0" w:sz="4" w:val="single"/>
+              <w:bottom w:color="bfbfbf" w:space="0" w:sz="4" w:val="single"/>
+              <w:right w:color="bfbfbf" w:space="0" w:sz="4" w:val="single"/>
+            </w:tcBorders>
+            <w:tcMar>
+              <w:top w:w="100.0" w:type="dxa"/>
+              <w:left w:w="150.0" w:type="dxa"/>
+              <w:bottom w:w="100.0" w:type="dxa"/>
+              <w:right w:w="150.0" w:type="dxa"/>
+            </w:tcMar>
+            <w:vAlign w:val="center"/>
+          </w:tcPr>
+          <w:p>
+            <w:pPr>
+              <w:jc w:val="left"/>
+              <w:rPr/>
+            </w:pPr>
+            <w:r>
+              <w:rPr>
+                <w:b w:val="0"/>
+                <w:bCs w:val="0"/>
+                <w:i w:val="0"/>
+                <w:iCs w:val="0"/>
+                <w:color w:val="000000"/>
+                <w:sz w:val="20"/>
+                <w:szCs w:val="20"/>
+                <w:rtl w:val="0"/>
+              </w:rPr>
+              <w:t>Wise US Inc, 108 W 13th St, Wilmington, DE, 19801, United States</w:t>
             </w:r>
             <w:r>
               <w:rPr>

</xml_diff>

<commit_message>
Keep the Lifecheq template layout, drop the routing-number row
The added routing-number line changed the banking table Lifecheq provided,
so remove it and restore the template's original five rows. Only the
account values change; every label is the template's own.

Also spell the contractor name in the invoice header as "Kok Leong Lim",
matching the Wise account, and regenerate LC006.

Verified against the template and the July invoice: 5 tables with
identical row and column counts, and identical banking labels. The only
first-column differences are the intended placeholder fills.
</commit_message>
<xml_diff>
--- a/Lifecheq Admin/Invoicing - Lim Kok Leong - August 2026.docx
+++ b/Lifecheq Admin/Invoicing - Lim Kok Leong - August 2026.docx
@@ -94,7 +94,7 @@
                 <w:szCs w:val="26"/>
                 <w:rtl w:val="0"/>
               </w:rPr>
-              <w:t>LIM Kok Leong</w:t>
+              <w:t>Kok Leong Lim</w:t>
             </w:r>
             <w:r>
               <w:rPr>
@@ -2091,95 +2091,6 @@
                 <w:rtl w:val="0"/>
               </w:rPr>
               <w:t>117452291368293</w:t>
-            </w:r>
-            <w:r>
-              <w:rPr>
-                <w:rtl w:val="0"/>
-              </w:rPr>
-            </w:r>
-          </w:p>
-        </w:tc>
-      </w:tr>
-      <w:tr>
-        <w:trPr>
-          <w:cantSplit w:val="0"/>
-          <w:tblHeader w:val="0"/>
-        </w:trPr>
-        <w:tc>
-          <w:tcPr>
-            <w:tcBorders>
-              <w:top w:color="bfbfbf" w:space="0" w:sz="4" w:val="single"/>
-              <w:left w:color="bfbfbf" w:space="0" w:sz="4" w:val="single"/>
-              <w:bottom w:color="bfbfbf" w:space="0" w:sz="4" w:val="single"/>
-              <w:right w:color="bfbfbf" w:space="0" w:sz="4" w:val="single"/>
-            </w:tcBorders>
-            <w:shd w:fill="f2f2f2" w:val="clear"/>
-            <w:tcMar>
-              <w:top w:w="100.0" w:type="dxa"/>
-              <w:left w:w="150.0" w:type="dxa"/>
-              <w:bottom w:w="100.0" w:type="dxa"/>
-              <w:right w:w="150.0" w:type="dxa"/>
-            </w:tcMar>
-            <w:vAlign w:val="center"/>
-          </w:tcPr>
-          <w:p>
-            <w:pPr>
-              <w:jc w:val="left"/>
-              <w:rPr/>
-            </w:pPr>
-            <w:r>
-              <w:rPr>
-                <w:b w:val="1"/>
-                <w:bCs w:val="1"/>
-                <w:i w:val="0"/>
-                <w:iCs w:val="0"/>
-                <w:color w:val="000000"/>
-                <w:sz w:val="20"/>
-                <w:szCs w:val="20"/>
-                <w:rtl w:val="0"/>
-              </w:rPr>
-              <w:t>Routing Number (ACH/wire):</w:t>
-            </w:r>
-            <w:r>
-              <w:rPr>
-                <w:rtl w:val="0"/>
-              </w:rPr>
-            </w:r>
-          </w:p>
-        </w:tc>
-        <w:tc>
-          <w:tcPr>
-            <w:tcBorders>
-              <w:top w:color="bfbfbf" w:space="0" w:sz="4" w:val="single"/>
-              <w:left w:color="bfbfbf" w:space="0" w:sz="4" w:val="single"/>
-              <w:bottom w:color="bfbfbf" w:space="0" w:sz="4" w:val="single"/>
-              <w:right w:color="bfbfbf" w:space="0" w:sz="4" w:val="single"/>
-            </w:tcBorders>
-            <w:tcMar>
-              <w:top w:w="100.0" w:type="dxa"/>
-              <w:left w:w="150.0" w:type="dxa"/>
-              <w:bottom w:w="100.0" w:type="dxa"/>
-              <w:right w:w="150.0" w:type="dxa"/>
-            </w:tcMar>
-            <w:vAlign w:val="center"/>
-          </w:tcPr>
-          <w:p>
-            <w:pPr>
-              <w:jc w:val="left"/>
-              <w:rPr/>
-            </w:pPr>
-            <w:r>
-              <w:rPr>
-                <w:b w:val="0"/>
-                <w:bCs w:val="0"/>
-                <w:i w:val="0"/>
-                <w:iCs w:val="0"/>
-                <w:color w:val="000000"/>
-                <w:sz w:val="20"/>
-                <w:szCs w:val="20"/>
-                <w:rtl w:val="0"/>
-              </w:rPr>
-              <w:t>084009519</w:t>
             </w:r>
             <w:r>
               <w:rPr>

</xml_diff>